<commit_message>
add high number words practice
</commit_message>
<xml_diff>
--- a/农林国际学术交流英语高频词汇表1.docx
+++ b/农林国际学术交流英语高频词汇表1.docx
@@ -14,75 +14,216 @@
       </w:r>
     </w:p>
     <w:p>
+      <w:pPr>
+        <w:rPr>
+          <w:rFonts w:hint="eastAsia"/>
+        </w:rPr>
+      </w:pPr>
       <w:r>
         <w:rPr>
           <w:rFonts w:hint="eastAsia"/>
         </w:rPr>
         <w:t>Genetic modification</w:t>
       </w:r>
-    </w:p>
-    <w:p>
+      <w:r>
+        <w:tab/>
+      </w:r>
+      <w:r>
+        <w:rPr>
+          <w:rFonts w:hint="eastAsia"/>
+        </w:rPr>
+        <w:t>基因修改</w:t>
+      </w:r>
+    </w:p>
+    <w:p>
+      <w:pPr>
+        <w:rPr>
+          <w:rFonts w:hint="eastAsia"/>
+        </w:rPr>
+      </w:pPr>
       <w:r>
         <w:rPr>
           <w:rFonts w:hint="eastAsia"/>
         </w:rPr>
         <w:t>Molecule</w:t>
       </w:r>
-    </w:p>
-    <w:p>
+      <w:r>
+        <w:tab/>
+      </w:r>
+      <w:r>
+        <w:rPr>
+          <w:rFonts w:hint="eastAsia"/>
+        </w:rPr>
+        <w:t>分子</w:t>
+      </w:r>
+    </w:p>
+    <w:p>
+      <w:pPr>
+        <w:rPr>
+          <w:rFonts w:hint="eastAsia"/>
+        </w:rPr>
+      </w:pPr>
       <w:r>
         <w:rPr>
           <w:rFonts w:hint="eastAsia"/>
         </w:rPr>
         <w:t>Reproduction</w:t>
       </w:r>
-    </w:p>
-    <w:p>
+      <w:r>
+        <w:tab/>
+      </w:r>
+      <w:r>
+        <w:rPr>
+          <w:rFonts w:hint="eastAsia"/>
+        </w:rPr>
+        <w:t>繁殖</w:t>
+      </w:r>
+    </w:p>
+    <w:p>
+      <w:pPr>
+        <w:rPr>
+          <w:rFonts w:hint="eastAsia"/>
+        </w:rPr>
+      </w:pPr>
       <w:r>
         <w:rPr>
           <w:rFonts w:hint="eastAsia"/>
         </w:rPr>
         <w:t>Encode</w:t>
       </w:r>
-    </w:p>
-    <w:p>
+      <w:r>
+        <w:tab/>
+      </w:r>
+      <w:r>
+        <w:rPr>
+          <w:rFonts w:hint="eastAsia"/>
+        </w:rPr>
+        <w:t>编码</w:t>
+      </w:r>
+    </w:p>
+    <w:p>
+      <w:pPr>
+        <w:rPr>
+          <w:rFonts w:hint="eastAsia"/>
+        </w:rPr>
+      </w:pPr>
       <w:r>
         <w:rPr>
           <w:rFonts w:hint="eastAsia"/>
         </w:rPr>
         <w:t>Instruction</w:t>
       </w:r>
-    </w:p>
-    <w:p>
+      <w:r>
+        <w:tab/>
+      </w:r>
+      <w:r>
+        <w:rPr>
+          <w:rFonts w:hint="eastAsia"/>
+        </w:rPr>
+        <w:t>指导</w:t>
+      </w:r>
+    </w:p>
+    <w:p>
+      <w:pPr>
+        <w:rPr>
+          <w:rFonts w:hint="eastAsia"/>
+        </w:rPr>
+      </w:pPr>
       <w:r>
         <w:rPr>
           <w:rFonts w:hint="eastAsia"/>
         </w:rPr>
         <w:t>Mutation</w:t>
       </w:r>
-    </w:p>
-    <w:p>
+      <w:r>
+        <w:tab/>
+      </w:r>
+      <w:r>
+        <w:rPr>
+          <w:rFonts w:hint="eastAsia"/>
+        </w:rPr>
+        <w:t>腐烂</w:t>
+      </w:r>
+    </w:p>
+    <w:p>
+      <w:pPr>
+        <w:rPr>
+          <w:rFonts w:hint="eastAsia"/>
+        </w:rPr>
+      </w:pPr>
       <w:r>
         <w:rPr>
           <w:rFonts w:hint="eastAsia"/>
         </w:rPr>
         <w:t>Chemical</w:t>
       </w:r>
-    </w:p>
-    <w:p>
-      <w:r>
-        <w:rPr>
-          <w:rFonts w:hint="eastAsia"/>
-        </w:rPr>
-        <w:t>Controversy</w:t>
-      </w:r>
-    </w:p>
-    <w:p>
-      <w:r>
-        <w:rPr>
-          <w:rFonts w:hint="eastAsia"/>
-        </w:rPr>
-        <w:t>Available</w:t>
+      <w:r>
+        <w:tab/>
+      </w:r>
+      <w:r>
+        <w:rPr>
+          <w:rFonts w:hint="eastAsia"/>
+        </w:rPr>
+        <w:t>化学的</w:t>
+      </w:r>
+    </w:p>
+    <w:p>
+      <w:pPr>
+        <w:rPr>
+          <w:rFonts w:hint="eastAsia"/>
+        </w:rPr>
+      </w:pPr>
+      <w:r>
+        <w:rPr>
+          <w:rFonts w:hint="eastAsia"/>
+        </w:rPr>
+        <w:t>Controvers</w:t>
+      </w:r>
+      <w:r>
+        <w:t>y</w:t>
+      </w:r>
+      <w:r>
+        <w:tab/>
+      </w:r>
+      <w:r>
+        <w:tab/>
+      </w:r>
+      <w:r>
+        <w:rPr>
+          <w:rFonts w:hint="eastAsia"/>
+        </w:rPr>
+        <w:t>争论冲突</w:t>
+      </w:r>
+    </w:p>
+    <w:p>
+      <w:r>
+        <w:rPr>
+          <w:rFonts w:hint="eastAsia"/>
+        </w:rPr>
+        <w:t>Availabl</w:t>
+      </w:r>
+      <w:r>
+        <w:rPr>
+          <w:rFonts w:hint="eastAsia"/>
+        </w:rPr>
+        <w:t>e</w:t>
+      </w:r>
+      <w:r>
+        <w:tab/>
+      </w:r>
+      <w:r>
+        <w:rPr>
+          <w:rFonts w:hint="eastAsia"/>
+        </w:rPr>
+        <w:t>可到达的</w:t>
+      </w:r>
+    </w:p>
+    <w:p>
+      <w:r>
+        <w:rPr>
+          <w:rFonts w:hint="eastAsia"/>
+        </w:rPr>
+        <w:t>gene editing</w:t>
       </w:r>
       <w:r>
         <w:rPr>
@@ -90,13 +231,99 @@
         </w:rPr>
         <w:t xml:space="preserve"> </w:t>
       </w:r>
-    </w:p>
-    <w:p>
-      <w:r>
-        <w:rPr>
-          <w:rFonts w:hint="eastAsia"/>
-        </w:rPr>
-        <w:t>gene editing</w:t>
+      <w:r>
+        <w:tab/>
+      </w:r>
+      <w:r>
+        <w:rPr>
+          <w:rFonts w:hint="eastAsia"/>
+        </w:rPr>
+        <w:t>基因编辑</w:t>
+      </w:r>
+    </w:p>
+    <w:p>
+      <w:pPr>
+        <w:rPr>
+          <w:rFonts w:hint="eastAsia"/>
+        </w:rPr>
+      </w:pPr>
+      <w:r>
+        <w:rPr>
+          <w:rFonts w:hint="eastAsia"/>
+        </w:rPr>
+        <w:t>genome</w:t>
+      </w:r>
+      <w:r>
+        <w:tab/>
+      </w:r>
+      <w:r>
+        <w:tab/>
+      </w:r>
+      <w:r>
+        <w:rPr>
+          <w:rFonts w:hint="eastAsia"/>
+        </w:rPr>
+        <w:t>基因组</w:t>
+      </w:r>
+    </w:p>
+    <w:p>
+      <w:pPr>
+        <w:rPr>
+          <w:rFonts w:hint="eastAsia"/>
+        </w:rPr>
+      </w:pPr>
+      <w:r>
+        <w:rPr>
+          <w:rFonts w:hint="eastAsia"/>
+        </w:rPr>
+        <w:t>DNA sequencing</w:t>
+      </w:r>
+      <w:r>
+        <w:tab/>
+      </w:r>
+      <w:r>
+        <w:tab/>
+      </w:r>
+      <w:r>
+        <w:rPr>
+          <w:rFonts w:hint="eastAsia"/>
+        </w:rPr>
+        <w:t>DNA序列</w:t>
+      </w:r>
+    </w:p>
+    <w:p>
+      <w:pPr>
+        <w:rPr>
+          <w:rFonts w:hint="eastAsia"/>
+        </w:rPr>
+      </w:pPr>
+      <w:r>
+        <w:rPr>
+          <w:rFonts w:hint="eastAsia"/>
+        </w:rPr>
+        <w:t>Transgenic</w:t>
+      </w:r>
+      <w:r>
+        <w:tab/>
+      </w:r>
+      <w:r>
+        <w:rPr>
+          <w:rFonts w:hint="eastAsia"/>
+        </w:rPr>
+        <w:t>遗传</w:t>
+      </w:r>
+    </w:p>
+    <w:p>
+      <w:pPr>
+        <w:rPr>
+          <w:rFonts w:hint="eastAsia"/>
+        </w:rPr>
+      </w:pPr>
+      <w:r>
+        <w:rPr>
+          <w:rFonts w:hint="eastAsia"/>
+        </w:rPr>
+        <w:t>Application</w:t>
       </w:r>
       <w:r>
         <w:rPr>
@@ -104,37 +331,25 @@
         </w:rPr>
         <w:t xml:space="preserve"> </w:t>
       </w:r>
-    </w:p>
-    <w:p>
-      <w:r>
-        <w:rPr>
-          <w:rFonts w:hint="eastAsia"/>
-        </w:rPr>
-        <w:t>genome</w:t>
-      </w:r>
-    </w:p>
-    <w:p>
-      <w:r>
-        <w:rPr>
-          <w:rFonts w:hint="eastAsia"/>
-        </w:rPr>
-        <w:t>DNA sequencing</w:t>
-      </w:r>
-    </w:p>
-    <w:p>
-      <w:r>
-        <w:rPr>
-          <w:rFonts w:hint="eastAsia"/>
-        </w:rPr>
-        <w:t>Transgenic</w:t>
-      </w:r>
-    </w:p>
-    <w:p>
-      <w:r>
-        <w:rPr>
-          <w:rFonts w:hint="eastAsia"/>
-        </w:rPr>
-        <w:t>Application</w:t>
+      <w:r>
+        <w:tab/>
+      </w:r>
+      <w:r>
+        <w:tab/>
+      </w:r>
+      <w:r>
+        <w:rPr>
+          <w:rFonts w:hint="eastAsia"/>
+        </w:rPr>
+        <w:t>应用</w:t>
+      </w:r>
+    </w:p>
+    <w:p>
+      <w:r>
+        <w:rPr>
+          <w:rFonts w:hint="eastAsia"/>
+        </w:rPr>
+        <w:t>Species</w:t>
       </w:r>
       <w:r>
         <w:rPr>
@@ -142,13 +357,24 @@
         </w:rPr>
         <w:t xml:space="preserve"> </w:t>
       </w:r>
-    </w:p>
-    <w:p>
-      <w:r>
-        <w:rPr>
-          <w:rFonts w:hint="eastAsia"/>
-        </w:rPr>
-        <w:t>Species</w:t>
+      <w:r>
+        <w:rPr>
+          <w:rFonts w:hint="eastAsia"/>
+        </w:rPr>
+        <w:t>种类</w:t>
+      </w:r>
+    </w:p>
+    <w:p>
+      <w:pPr>
+        <w:rPr>
+          <w:rFonts w:hint="eastAsia"/>
+        </w:rPr>
+      </w:pPr>
+      <w:r>
+        <w:rPr>
+          <w:rFonts w:hint="eastAsia"/>
+        </w:rPr>
+        <w:t>Organism</w:t>
       </w:r>
       <w:r>
         <w:rPr>
@@ -156,13 +382,27 @@
         </w:rPr>
         <w:t xml:space="preserve"> </w:t>
       </w:r>
-    </w:p>
-    <w:p>
-      <w:r>
-        <w:rPr>
-          <w:rFonts w:hint="eastAsia"/>
-        </w:rPr>
-        <w:t>Organism</w:t>
+      <w:r>
+        <w:tab/>
+      </w:r>
+      <w:r>
+        <w:rPr>
+          <w:rFonts w:hint="eastAsia"/>
+        </w:rPr>
+        <w:t>有机物</w:t>
+      </w:r>
+    </w:p>
+    <w:p>
+      <w:pPr>
+        <w:rPr>
+          <w:rFonts w:hint="eastAsia"/>
+        </w:rPr>
+      </w:pPr>
+      <w:r>
+        <w:rPr>
+          <w:rFonts w:hint="eastAsia"/>
+        </w:rPr>
+        <w:t>Sustainability</w:t>
       </w:r>
       <w:r>
         <w:rPr>
@@ -170,13 +410,27 @@
         </w:rPr>
         <w:t xml:space="preserve"> </w:t>
       </w:r>
-    </w:p>
-    <w:p>
-      <w:r>
-        <w:rPr>
-          <w:rFonts w:hint="eastAsia"/>
-        </w:rPr>
-        <w:t>Sustainability</w:t>
+      <w:r>
+        <w:tab/>
+      </w:r>
+      <w:r>
+        <w:rPr>
+          <w:rFonts w:hint="eastAsia"/>
+        </w:rPr>
+        <w:t>持续性</w:t>
+      </w:r>
+    </w:p>
+    <w:p>
+      <w:pPr>
+        <w:rPr>
+          <w:rFonts w:hint="eastAsia"/>
+        </w:rPr>
+      </w:pPr>
+      <w:r>
+        <w:rPr>
+          <w:rFonts w:hint="eastAsia"/>
+        </w:rPr>
+        <w:t>Circulate</w:t>
       </w:r>
       <w:r>
         <w:rPr>
@@ -184,13 +438,96 @@
         </w:rPr>
         <w:t xml:space="preserve"> </w:t>
       </w:r>
-    </w:p>
-    <w:p>
-      <w:r>
-        <w:rPr>
-          <w:rFonts w:hint="eastAsia"/>
-        </w:rPr>
-        <w:t>Circulate</w:t>
+      <w:r>
+        <w:tab/>
+      </w:r>
+      <w:r>
+        <w:rPr>
+          <w:rFonts w:hint="eastAsia"/>
+        </w:rPr>
+        <w:t>循环</w:t>
+      </w:r>
+    </w:p>
+    <w:p>
+      <w:pPr>
+        <w:rPr>
+          <w:rFonts w:hint="eastAsia"/>
+        </w:rPr>
+      </w:pPr>
+      <w:r>
+        <w:rPr>
+          <w:rFonts w:hint="eastAsia"/>
+        </w:rPr>
+        <w:t>Produce</w:t>
+      </w:r>
+      <w:r>
+        <w:tab/>
+      </w:r>
+      <w:r>
+        <w:tab/>
+      </w:r>
+      <w:r>
+        <w:rPr>
+          <w:rFonts w:hint="eastAsia"/>
+        </w:rPr>
+        <w:t>生产</w:t>
+      </w:r>
+    </w:p>
+    <w:p>
+      <w:pPr>
+        <w:rPr>
+          <w:rFonts w:hint="eastAsia"/>
+        </w:rPr>
+      </w:pPr>
+      <w:r>
+        <w:rPr>
+          <w:rFonts w:hint="eastAsia"/>
+        </w:rPr>
+        <w:t>Horticulture</w:t>
+      </w:r>
+      <w:r>
+        <w:tab/>
+      </w:r>
+      <w:r>
+        <w:rPr>
+          <w:rFonts w:hint="eastAsia"/>
+        </w:rPr>
+        <w:t>园艺学</w:t>
+      </w:r>
+    </w:p>
+    <w:p>
+      <w:pPr>
+        <w:rPr>
+          <w:rFonts w:hint="eastAsia"/>
+        </w:rPr>
+      </w:pPr>
+      <w:r>
+        <w:rPr>
+          <w:rFonts w:hint="eastAsia"/>
+        </w:rPr>
+        <w:t>Restriction</w:t>
+      </w:r>
+      <w:r>
+        <w:tab/>
+      </w:r>
+      <w:r>
+        <w:rPr>
+          <w:rFonts w:hint="eastAsia"/>
+        </w:rPr>
+        <w:t>限制</w:t>
+      </w:r>
+    </w:p>
+    <w:p>
+      <w:pPr>
+        <w:rPr>
+          <w:rFonts w:hint="eastAsia"/>
+        </w:rPr>
+      </w:pPr>
+      <w:r>
+        <w:rPr>
+          <w:rFonts w:hint="eastAsia"/>
+        </w:rPr>
+        <w:t>Biodiversity</w:t>
       </w:r>
       <w:r>
         <w:rPr>
@@ -198,78 +535,119 @@
         </w:rPr>
         <w:t xml:space="preserve"> </w:t>
       </w:r>
-    </w:p>
-    <w:p>
-      <w:r>
-        <w:rPr>
-          <w:rFonts w:hint="eastAsia"/>
-        </w:rPr>
-        <w:t>Produce</w:t>
-      </w:r>
-    </w:p>
-    <w:p>
-      <w:r>
-        <w:rPr>
-          <w:rFonts w:hint="eastAsia"/>
-        </w:rPr>
-        <w:t>Horticulture</w:t>
-      </w:r>
-    </w:p>
-    <w:p>
-      <w:r>
-        <w:rPr>
-          <w:rFonts w:hint="eastAsia"/>
-        </w:rPr>
-        <w:t>Restriction</w:t>
-      </w:r>
-    </w:p>
-    <w:p>
-      <w:r>
-        <w:rPr>
-          <w:rFonts w:hint="eastAsia"/>
-        </w:rPr>
-        <w:t>Biodiversity</w:t>
-      </w:r>
-      <w:r>
-        <w:rPr>
-          <w:rFonts w:hint="eastAsia"/>
-        </w:rPr>
-        <w:t xml:space="preserve"> </w:t>
-      </w:r>
-    </w:p>
-    <w:p>
+      <w:r>
+        <w:tab/>
+      </w:r>
+      <w:r>
+        <w:tab/>
+      </w:r>
+      <w:r>
+        <w:rPr>
+          <w:rFonts w:hint="eastAsia"/>
+        </w:rPr>
+        <w:t>生物多样性</w:t>
+      </w:r>
+    </w:p>
+    <w:p>
+      <w:pPr>
+        <w:rPr>
+          <w:rFonts w:hint="eastAsia"/>
+        </w:rPr>
+      </w:pPr>
       <w:r>
         <w:rPr>
           <w:rFonts w:hint="eastAsia"/>
         </w:rPr>
         <w:t>Urban</w:t>
       </w:r>
-    </w:p>
-    <w:p>
+      <w:r>
+        <w:tab/>
+      </w:r>
+      <w:r>
+        <w:rPr>
+          <w:rFonts w:hint="eastAsia"/>
+        </w:rPr>
+        <w:t>城市</w:t>
+      </w:r>
+    </w:p>
+    <w:p>
+      <w:pPr>
+        <w:rPr>
+          <w:rFonts w:hint="eastAsia"/>
+        </w:rPr>
+      </w:pPr>
       <w:r>
         <w:rPr>
           <w:rFonts w:hint="eastAsia"/>
         </w:rPr>
         <w:t>Permaculture</w:t>
       </w:r>
-    </w:p>
-    <w:p>
+      <w:r>
+        <w:tab/>
+      </w:r>
+      <w:r>
+        <w:tab/>
+      </w:r>
+      <w:r>
+        <w:rPr>
+          <w:rFonts w:hint="eastAsia"/>
+        </w:rPr>
+        <w:t>永续农业</w:t>
+      </w:r>
+    </w:p>
+    <w:p>
+      <w:pPr>
+        <w:rPr>
+          <w:rFonts w:hint="eastAsia"/>
+        </w:rPr>
+      </w:pPr>
       <w:r>
         <w:rPr>
           <w:rFonts w:hint="eastAsia"/>
         </w:rPr>
         <w:t>Massive</w:t>
       </w:r>
-    </w:p>
-    <w:p>
+      <w:r>
+        <w:tab/>
+      </w:r>
+      <w:r>
+        <w:tab/>
+      </w:r>
+      <w:r>
+        <w:rPr>
+          <w:rFonts w:hint="eastAsia"/>
+        </w:rPr>
+        <w:t>大量的</w:t>
+      </w:r>
+    </w:p>
+    <w:p>
+      <w:pPr>
+        <w:rPr>
+          <w:rFonts w:hint="eastAsia"/>
+        </w:rPr>
+      </w:pPr>
       <w:r>
         <w:rPr>
           <w:rFonts w:hint="eastAsia"/>
         </w:rPr>
         <w:t>agricultural output</w:t>
       </w:r>
-    </w:p>
-    <w:p>
+      <w:r>
+        <w:tab/>
+      </w:r>
+      <w:r>
+        <w:rPr>
+          <w:rFonts w:hint="eastAsia"/>
+        </w:rPr>
+        <w:t>农业产量</w:t>
+      </w:r>
+    </w:p>
+    <w:p>
+      <w:pPr>
+        <w:rPr>
+          <w:rFonts w:hint="eastAsia"/>
+        </w:rPr>
+      </w:pPr>
       <w:r>
         <w:rPr>
           <w:rFonts w:hint="eastAsia"/>
@@ -277,6 +655,15 @@
         <w:lastRenderedPageBreak/>
         <w:t>significant</w:t>
       </w:r>
+      <w:r>
+        <w:tab/>
+      </w:r>
+      <w:r>
+        <w:rPr>
+          <w:rFonts w:hint="eastAsia"/>
+        </w:rPr>
+        <w:t>显著的</w:t>
+      </w:r>
     </w:p>
     <w:p>
       <w:r>
@@ -291,6 +678,12 @@
         </w:rPr>
         <w:t xml:space="preserve"> </w:t>
       </w:r>
+      <w:r>
+        <w:rPr>
+          <w:rFonts w:hint="eastAsia"/>
+        </w:rPr>
+        <w:t>？</w:t>
+      </w:r>
     </w:p>
     <w:p>
       <w:r>
@@ -305,16 +698,41 @@
         </w:rPr>
         <w:t xml:space="preserve"> </w:t>
       </w:r>
-    </w:p>
-    <w:p>
+      <w:r>
+        <w:rPr>
+          <w:rFonts w:hint="eastAsia"/>
+        </w:rPr>
+        <w:t>获得</w:t>
+      </w:r>
+    </w:p>
+    <w:p>
+      <w:pPr>
+        <w:rPr>
+          <w:rFonts w:hint="eastAsia"/>
+        </w:rPr>
+      </w:pPr>
       <w:r>
         <w:rPr>
           <w:rFonts w:hint="eastAsia"/>
         </w:rPr>
         <w:t>global</w:t>
       </w:r>
-    </w:p>
-    <w:p>
+      <w:r>
+        <w:tab/>
+      </w:r>
+      <w:r>
+        <w:rPr>
+          <w:rFonts w:hint="eastAsia"/>
+        </w:rPr>
+        <w:t>全球的</w:t>
+      </w:r>
+    </w:p>
+    <w:p>
+      <w:pPr>
+        <w:rPr>
+          <w:rFonts w:hint="eastAsia"/>
+        </w:rPr>
+      </w:pPr>
       <w:r>
         <w:rPr>
           <w:rFonts w:hint="eastAsia"/>
@@ -327,72 +745,198 @@
         </w:rPr>
         <w:t xml:space="preserve"> </w:t>
       </w:r>
-    </w:p>
-    <w:p>
+      <w:r>
+        <w:rPr>
+          <w:rFonts w:hint="eastAsia"/>
+        </w:rPr>
+        <w:t>发明</w:t>
+      </w:r>
+    </w:p>
+    <w:p>
+      <w:pPr>
+        <w:rPr>
+          <w:rFonts w:hint="eastAsia"/>
+        </w:rPr>
+      </w:pPr>
       <w:r>
         <w:rPr>
           <w:rFonts w:hint="eastAsia"/>
         </w:rPr>
         <w:t>climate-proof</w:t>
       </w:r>
-    </w:p>
-    <w:p>
+      <w:r>
+        <w:tab/>
+      </w:r>
+      <w:r>
+        <w:rPr>
+          <w:rFonts w:hint="eastAsia"/>
+        </w:rPr>
+        <w:t>抗天气变化的</w:t>
+      </w:r>
+    </w:p>
+    <w:p>
+      <w:pPr>
+        <w:rPr>
+          <w:rFonts w:hint="eastAsia"/>
+        </w:rPr>
+      </w:pPr>
       <w:r>
         <w:rPr>
           <w:rFonts w:hint="eastAsia"/>
         </w:rPr>
         <w:t>conventional</w:t>
       </w:r>
-    </w:p>
-    <w:p>
+      <w:r>
+        <w:tab/>
+      </w:r>
+      <w:r>
+        <w:tab/>
+      </w:r>
+      <w:r>
+        <w:rPr>
+          <w:rFonts w:hint="eastAsia"/>
+        </w:rPr>
+        <w:t>传统的</w:t>
+      </w:r>
+    </w:p>
+    <w:p>
+      <w:pPr>
+        <w:rPr>
+          <w:rFonts w:hint="eastAsia"/>
+        </w:rPr>
+      </w:pPr>
       <w:r>
         <w:rPr>
           <w:rFonts w:hint="eastAsia"/>
         </w:rPr>
         <w:t>indoor vertical farming</w:t>
       </w:r>
-    </w:p>
-    <w:p>
+      <w:r>
+        <w:tab/>
+      </w:r>
+      <w:r>
+        <w:rPr>
+          <w:rFonts w:hint="eastAsia"/>
+        </w:rPr>
+        <w:t>室内垂直农场</w:t>
+      </w:r>
+    </w:p>
+    <w:p>
+      <w:pPr>
+        <w:rPr>
+          <w:rFonts w:hint="eastAsia"/>
+        </w:rPr>
+      </w:pPr>
       <w:r>
         <w:rPr>
           <w:rFonts w:hint="eastAsia"/>
         </w:rPr>
         <w:t xml:space="preserve">efficient </w:t>
       </w:r>
-    </w:p>
-    <w:p>
+      <w:r>
+        <w:tab/>
+      </w:r>
+      <w:r>
+        <w:rPr>
+          <w:rFonts w:hint="eastAsia"/>
+        </w:rPr>
+        <w:t>有效的</w:t>
+      </w:r>
+    </w:p>
+    <w:p>
+      <w:pPr>
+        <w:rPr>
+          <w:rFonts w:hint="eastAsia"/>
+        </w:rPr>
+      </w:pPr>
       <w:r>
         <w:rPr>
           <w:rFonts w:hint="eastAsia"/>
         </w:rPr>
         <w:t>affordable</w:t>
       </w:r>
-    </w:p>
-    <w:p>
+      <w:r>
+        <w:tab/>
+      </w:r>
+      <w:r>
+        <w:rPr>
+          <w:rFonts w:hint="eastAsia"/>
+        </w:rPr>
+        <w:t>可负担的</w:t>
+      </w:r>
+    </w:p>
+    <w:p>
+      <w:pPr>
+        <w:rPr>
+          <w:rFonts w:hint="eastAsia"/>
+        </w:rPr>
+      </w:pPr>
       <w:r>
         <w:rPr>
           <w:rFonts w:hint="eastAsia"/>
         </w:rPr>
         <w:t>available</w:t>
       </w:r>
-    </w:p>
-    <w:p>
+      <w:r>
+        <w:tab/>
+      </w:r>
+      <w:r>
+        <w:tab/>
+      </w:r>
+      <w:r>
+        <w:rPr>
+          <w:rFonts w:hint="eastAsia"/>
+        </w:rPr>
+        <w:t>可到达的</w:t>
+      </w:r>
+    </w:p>
+    <w:p>
+      <w:pPr>
+        <w:rPr>
+          <w:rFonts w:hint="eastAsia"/>
+        </w:rPr>
+      </w:pPr>
       <w:r>
         <w:rPr>
           <w:rFonts w:hint="eastAsia"/>
         </w:rPr>
         <w:t>artificial substitutes</w:t>
       </w:r>
-    </w:p>
-    <w:p>
+      <w:r>
+        <w:tab/>
+      </w:r>
+      <w:r>
+        <w:rPr>
+          <w:rFonts w:hint="eastAsia"/>
+        </w:rPr>
+        <w:t>人工替代品</w:t>
+      </w:r>
+    </w:p>
+    <w:p>
+      <w:pPr>
+        <w:rPr>
+          <w:rFonts w:hint="eastAsia"/>
+        </w:rPr>
+      </w:pPr>
       <w:r>
         <w:rPr>
           <w:rFonts w:hint="eastAsia"/>
         </w:rPr>
         <w:t xml:space="preserve">utilize </w:t>
       </w:r>
-    </w:p>
-    <w:p>
+      <w:r>
+        <w:rPr>
+          <w:rFonts w:hint="eastAsia"/>
+        </w:rPr>
+        <w:t>利用</w:t>
+      </w:r>
+    </w:p>
+    <w:p>
+      <w:pPr>
+        <w:rPr>
+          <w:rFonts w:hint="eastAsia"/>
+        </w:rPr>
+      </w:pPr>
       <w:r>
         <w:rPr>
           <w:rFonts w:hint="eastAsia"/>
@@ -405,112 +949,320 @@
         </w:rPr>
         <w:t>ation</w:t>
       </w:r>
-    </w:p>
-    <w:p>
+      <w:r>
+        <w:tab/>
+      </w:r>
+      <w:r>
+        <w:rPr>
+          <w:rFonts w:hint="eastAsia"/>
+        </w:rPr>
+        <w:t>安装</w:t>
+      </w:r>
+    </w:p>
+    <w:p>
+      <w:pPr>
+        <w:rPr>
+          <w:rFonts w:hint="eastAsia"/>
+        </w:rPr>
+      </w:pPr>
       <w:r>
         <w:rPr>
           <w:rFonts w:hint="eastAsia"/>
         </w:rPr>
         <w:t>facility</w:t>
       </w:r>
-    </w:p>
-    <w:p>
+      <w:r>
+        <w:tab/>
+      </w:r>
+      <w:r>
+        <w:rPr>
+          <w:rFonts w:hint="eastAsia"/>
+        </w:rPr>
+        <w:t>工厂</w:t>
+      </w:r>
+    </w:p>
+    <w:p>
+      <w:pPr>
+        <w:rPr>
+          <w:rFonts w:hint="eastAsia"/>
+        </w:rPr>
+      </w:pPr>
       <w:r>
         <w:rPr>
           <w:rFonts w:hint="eastAsia"/>
         </w:rPr>
         <w:t>degradable</w:t>
       </w:r>
-    </w:p>
-    <w:p>
+      <w:r>
+        <w:tab/>
+      </w:r>
+      <w:r>
+        <w:rPr>
+          <w:rFonts w:hint="eastAsia"/>
+        </w:rPr>
+        <w:t>消减</w:t>
+      </w:r>
+    </w:p>
+    <w:p>
+      <w:pPr>
+        <w:rPr>
+          <w:rFonts w:hint="eastAsia"/>
+        </w:rPr>
+      </w:pPr>
       <w:r>
         <w:rPr>
           <w:rFonts w:hint="eastAsia"/>
         </w:rPr>
         <w:t>nutrient</w:t>
       </w:r>
-    </w:p>
-    <w:p>
+      <w:r>
+        <w:tab/>
+      </w:r>
+      <w:r>
+        <w:rPr>
+          <w:rFonts w:hint="eastAsia"/>
+        </w:rPr>
+        <w:t>营养</w:t>
+      </w:r>
+    </w:p>
+    <w:p>
+      <w:pPr>
+        <w:rPr>
+          <w:rFonts w:hint="eastAsia"/>
+        </w:rPr>
+      </w:pPr>
       <w:r>
         <w:rPr>
           <w:rFonts w:hint="eastAsia"/>
         </w:rPr>
         <w:t>formula</w:t>
       </w:r>
-    </w:p>
-    <w:p>
+      <w:r>
+        <w:tab/>
+      </w:r>
+      <w:r>
+        <w:rPr>
+          <w:rFonts w:hint="eastAsia"/>
+        </w:rPr>
+        <w:t>公式</w:t>
+      </w:r>
+    </w:p>
+    <w:p>
+      <w:pPr>
+        <w:rPr>
+          <w:rFonts w:hint="eastAsia"/>
+        </w:rPr>
+      </w:pPr>
       <w:r>
         <w:rPr>
           <w:rFonts w:hint="eastAsia"/>
         </w:rPr>
         <w:t>circulate</w:t>
       </w:r>
-    </w:p>
-    <w:p>
+      <w:r>
+        <w:tab/>
+      </w:r>
+      <w:r>
+        <w:rPr>
+          <w:rFonts w:hint="eastAsia"/>
+        </w:rPr>
+        <w:t>循环</w:t>
+      </w:r>
+    </w:p>
+    <w:p>
+      <w:pPr>
+        <w:rPr>
+          <w:rFonts w:hint="eastAsia"/>
+        </w:rPr>
+      </w:pPr>
       <w:r>
         <w:rPr>
           <w:rFonts w:hint="eastAsia"/>
         </w:rPr>
         <w:t>promote</w:t>
       </w:r>
-    </w:p>
-    <w:p>
+      <w:r>
+        <w:tab/>
+      </w:r>
+      <w:r>
+        <w:tab/>
+      </w:r>
+      <w:r>
+        <w:rPr>
+          <w:rFonts w:hint="eastAsia"/>
+        </w:rPr>
+        <w:t>提升、促进</w:t>
+      </w:r>
+    </w:p>
+    <w:p>
+      <w:pPr>
+        <w:rPr>
+          <w:rFonts w:hint="eastAsia"/>
+        </w:rPr>
+      </w:pPr>
       <w:r>
         <w:rPr>
           <w:rFonts w:hint="eastAsia"/>
         </w:rPr>
         <w:t>sophisticated</w:t>
       </w:r>
-    </w:p>
-    <w:p>
+      <w:r>
+        <w:tab/>
+      </w:r>
+      <w:r>
+        <w:tab/>
+      </w:r>
+      <w:r>
+        <w:rPr>
+          <w:rFonts w:hint="eastAsia"/>
+        </w:rPr>
+        <w:t>复杂的</w:t>
+      </w:r>
+    </w:p>
+    <w:p>
+      <w:pPr>
+        <w:rPr>
+          <w:rFonts w:hint="eastAsia"/>
+        </w:rPr>
+      </w:pPr>
       <w:r>
         <w:rPr>
           <w:rFonts w:hint="eastAsia"/>
         </w:rPr>
         <w:t>consistency</w:t>
       </w:r>
-    </w:p>
-    <w:p>
+      <w:r>
+        <w:tab/>
+      </w:r>
+      <w:r>
+        <w:rPr>
+          <w:rFonts w:hint="eastAsia"/>
+        </w:rPr>
+        <w:t>持续</w:t>
+      </w:r>
+    </w:p>
+    <w:p>
+      <w:pPr>
+        <w:rPr>
+          <w:rFonts w:hint="eastAsia"/>
+        </w:rPr>
+      </w:pPr>
       <w:r>
         <w:rPr>
           <w:rFonts w:hint="eastAsia"/>
         </w:rPr>
         <w:t>conserve</w:t>
       </w:r>
-    </w:p>
-    <w:p>
+      <w:r>
+        <w:tab/>
+      </w:r>
+      <w:r>
+        <w:tab/>
+      </w:r>
+      <w:r>
+        <w:rPr>
+          <w:rFonts w:hint="eastAsia"/>
+        </w:rPr>
+        <w:t>保存、节约</w:t>
+      </w:r>
+    </w:p>
+    <w:p>
+      <w:pPr>
+        <w:rPr>
+          <w:rFonts w:hint="eastAsia"/>
+        </w:rPr>
+      </w:pPr>
       <w:r>
         <w:rPr>
           <w:rFonts w:hint="eastAsia"/>
         </w:rPr>
         <w:t>yield</w:t>
       </w:r>
-    </w:p>
-    <w:p>
+      <w:r>
+        <w:tab/>
+      </w:r>
+      <w:r>
+        <w:rPr>
+          <w:rFonts w:hint="eastAsia"/>
+        </w:rPr>
+        <w:t>生产</w:t>
+      </w:r>
+    </w:p>
+    <w:p>
+      <w:pPr>
+        <w:rPr>
+          <w:rFonts w:hint="eastAsia"/>
+        </w:rPr>
+      </w:pPr>
       <w:r>
         <w:rPr>
           <w:rFonts w:hint="eastAsia"/>
         </w:rPr>
         <w:t>pesticide</w:t>
       </w:r>
-    </w:p>
-    <w:p>
+      <w:r>
+        <w:tab/>
+      </w:r>
+      <w:r>
+        <w:tab/>
+      </w:r>
+      <w:r>
+        <w:rPr>
+          <w:rFonts w:hint="eastAsia"/>
+        </w:rPr>
+        <w:t>害虫</w:t>
+      </w:r>
+    </w:p>
+    <w:p>
+      <w:pPr>
+        <w:rPr>
+          <w:rFonts w:hint="eastAsia"/>
+        </w:rPr>
+      </w:pPr>
       <w:r>
         <w:rPr>
           <w:rFonts w:hint="eastAsia"/>
         </w:rPr>
         <w:t>innovation</w:t>
       </w:r>
-    </w:p>
-    <w:p>
+      <w:r>
+        <w:tab/>
+      </w:r>
+      <w:r>
+        <w:rPr>
+          <w:rFonts w:hint="eastAsia"/>
+        </w:rPr>
+        <w:t>发明</w:t>
+      </w:r>
+    </w:p>
+    <w:p>
+      <w:pPr>
+        <w:rPr>
+          <w:rFonts w:hint="eastAsia"/>
+        </w:rPr>
+      </w:pPr>
       <w:r>
         <w:rPr>
           <w:rFonts w:hint="eastAsia"/>
         </w:rPr>
         <w:t>drawback</w:t>
       </w:r>
-    </w:p>
-    <w:p>
+      <w:r>
+        <w:tab/>
+      </w:r>
+      <w:r>
+        <w:rPr>
+          <w:rFonts w:hint="eastAsia"/>
+        </w:rPr>
+        <w:t>缺点</w:t>
+      </w:r>
+    </w:p>
+    <w:p>
+      <w:pPr>
+        <w:rPr>
+          <w:rFonts w:hint="eastAsia"/>
+        </w:rPr>
+      </w:pPr>
       <w:r>
         <w:rPr>
           <w:rFonts w:hint="eastAsia"/>
@@ -518,8 +1270,34 @@
         <w:lastRenderedPageBreak/>
         <w:t>have little or no access to</w:t>
       </w:r>
-    </w:p>
-    <w:p>
+      <w:r>
+        <w:tab/>
+      </w:r>
+      <w:r>
+        <w:tab/>
+      </w:r>
+      <w:r>
+        <w:rPr>
+          <w:rFonts w:hint="eastAsia"/>
+        </w:rPr>
+        <w:t>对</w:t>
+      </w:r>
+      <w:r>
+        <w:t>…</w:t>
+      </w:r>
+      <w:r>
+        <w:rPr>
+          <w:rFonts w:hint="eastAsia"/>
+        </w:rPr>
+        <w:t>没有办法</w:t>
+      </w:r>
+    </w:p>
+    <w:p>
+      <w:pPr>
+        <w:rPr>
+          <w:rFonts w:hint="eastAsia"/>
+        </w:rPr>
+      </w:pPr>
       <w:r>
         <w:rPr>
           <w:rFonts w:hint="eastAsia"/>
@@ -532,32 +1310,94 @@
         </w:rPr>
         <w:t xml:space="preserve"> community</w:t>
       </w:r>
-    </w:p>
-    <w:p>
+      <w:r>
+        <w:tab/>
+      </w:r>
+      <w:r>
+        <w:rPr>
+          <w:rFonts w:hint="eastAsia"/>
+        </w:rPr>
+        <w:t>弱势群体</w:t>
+      </w:r>
+    </w:p>
+    <w:p>
+      <w:pPr>
+        <w:rPr>
+          <w:rFonts w:hint="eastAsia"/>
+        </w:rPr>
+      </w:pPr>
       <w:r>
         <w:rPr>
           <w:rFonts w:hint="eastAsia"/>
         </w:rPr>
         <w:t>infrastructure</w:t>
       </w:r>
-    </w:p>
-    <w:p>
+      <w:r>
+        <w:tab/>
+      </w:r>
+      <w:r>
+        <w:tab/>
+      </w:r>
+      <w:r>
+        <w:rPr>
+          <w:rFonts w:hint="eastAsia"/>
+        </w:rPr>
+        <w:t>基建</w:t>
+      </w:r>
+    </w:p>
+    <w:p>
+      <w:pPr>
+        <w:rPr>
+          <w:rFonts w:hint="eastAsia"/>
+        </w:rPr>
+      </w:pPr>
       <w:r>
         <w:rPr>
           <w:rFonts w:hint="eastAsia"/>
         </w:rPr>
         <w:t>entrepreneurship</w:t>
       </w:r>
-    </w:p>
-    <w:p>
+      <w:r>
+        <w:tab/>
+      </w:r>
+      <w:r>
+        <w:tab/>
+      </w:r>
+      <w:r>
+        <w:rPr>
+          <w:rFonts w:hint="eastAsia"/>
+        </w:rPr>
+        <w:t>企业家精神</w:t>
+      </w:r>
+    </w:p>
+    <w:p>
+      <w:pPr>
+        <w:rPr>
+          <w:rFonts w:hint="eastAsia"/>
+        </w:rPr>
+      </w:pPr>
       <w:r>
         <w:rPr>
           <w:rFonts w:hint="eastAsia"/>
         </w:rPr>
         <w:t>social cohesion</w:t>
       </w:r>
-    </w:p>
-    <w:p>
+      <w:r>
+        <w:tab/>
+      </w:r>
+      <w:r>
+        <w:rPr>
+          <w:rFonts w:hint="eastAsia"/>
+        </w:rPr>
+        <w:t>社会融合</w:t>
+      </w:r>
+    </w:p>
+    <w:p>
+      <w:pPr>
+        <w:rPr>
+          <w:rFonts w:hint="eastAsia"/>
+        </w:rPr>
+      </w:pPr>
       <w:r>
         <w:rPr>
           <w:rFonts w:hint="eastAsia"/>
@@ -570,176 +1410,505 @@
         </w:rPr>
         <w:t xml:space="preserve"> </w:t>
       </w:r>
-    </w:p>
-    <w:p>
+      <w:r>
+        <w:tab/>
+      </w:r>
+      <w:r>
+        <w:rPr>
+          <w:rFonts w:hint="eastAsia"/>
+        </w:rPr>
+        <w:t>变化</w:t>
+      </w:r>
+    </w:p>
+    <w:p>
+      <w:pPr>
+        <w:rPr>
+          <w:rFonts w:hint="eastAsia"/>
+        </w:rPr>
+      </w:pPr>
       <w:r>
         <w:rPr>
           <w:rFonts w:hint="eastAsia"/>
         </w:rPr>
         <w:t>fertilizer</w:t>
       </w:r>
-    </w:p>
-    <w:p>
+      <w:r>
+        <w:tab/>
+      </w:r>
+      <w:r>
+        <w:tab/>
+      </w:r>
+      <w:r>
+        <w:rPr>
+          <w:rFonts w:hint="eastAsia"/>
+        </w:rPr>
+        <w:t>肥料</w:t>
+      </w:r>
+    </w:p>
+    <w:p>
+      <w:pPr>
+        <w:rPr>
+          <w:rFonts w:hint="eastAsia"/>
+        </w:rPr>
+      </w:pPr>
       <w:r>
         <w:rPr>
           <w:rFonts w:hint="eastAsia"/>
         </w:rPr>
         <w:t>transparent</w:t>
       </w:r>
-    </w:p>
-    <w:p>
+      <w:r>
+        <w:tab/>
+      </w:r>
+      <w:r>
+        <w:tab/>
+      </w:r>
+      <w:r>
+        <w:rPr>
+          <w:rFonts w:hint="eastAsia"/>
+        </w:rPr>
+        <w:t>透明的</w:t>
+      </w:r>
+    </w:p>
+    <w:p>
+      <w:pPr>
+        <w:rPr>
+          <w:rFonts w:hint="eastAsia"/>
+        </w:rPr>
+      </w:pPr>
       <w:r>
         <w:rPr>
           <w:rFonts w:hint="eastAsia"/>
         </w:rPr>
         <w:t>population density</w:t>
       </w:r>
-    </w:p>
-    <w:p>
+      <w:r>
+        <w:tab/>
+      </w:r>
+      <w:r>
+        <w:rPr>
+          <w:rFonts w:hint="eastAsia"/>
+        </w:rPr>
+        <w:t>人口密度</w:t>
+      </w:r>
+    </w:p>
+    <w:p>
+      <w:pPr>
+        <w:rPr>
+          <w:rFonts w:hint="eastAsia"/>
+        </w:rPr>
+      </w:pPr>
       <w:r>
         <w:rPr>
           <w:rFonts w:hint="eastAsia"/>
         </w:rPr>
         <w:t>transportation</w:t>
       </w:r>
-    </w:p>
-    <w:p>
+      <w:r>
+        <w:tab/>
+      </w:r>
+      <w:r>
+        <w:rPr>
+          <w:rFonts w:hint="eastAsia"/>
+        </w:rPr>
+        <w:t>交通运输</w:t>
+      </w:r>
+    </w:p>
+    <w:p>
+      <w:pPr>
+        <w:rPr>
+          <w:rFonts w:hint="eastAsia"/>
+        </w:rPr>
+      </w:pPr>
       <w:r>
         <w:rPr>
           <w:rFonts w:hint="eastAsia"/>
         </w:rPr>
         <w:t>deploy</w:t>
       </w:r>
-    </w:p>
-    <w:p>
+      <w:r>
+        <w:tab/>
+      </w:r>
+      <w:r>
+        <w:rPr>
+          <w:rFonts w:hint="eastAsia"/>
+        </w:rPr>
+        <w:t>陈列</w:t>
+      </w:r>
+    </w:p>
+    <w:p>
+      <w:pPr>
+        <w:rPr>
+          <w:rFonts w:hint="eastAsia"/>
+        </w:rPr>
+      </w:pPr>
       <w:r>
         <w:rPr>
           <w:rFonts w:hint="eastAsia"/>
         </w:rPr>
         <w:t>establish</w:t>
       </w:r>
-    </w:p>
-    <w:p>
+      <w:r>
+        <w:tab/>
+      </w:r>
+      <w:r>
+        <w:tab/>
+      </w:r>
+      <w:r>
+        <w:rPr>
+          <w:rFonts w:hint="eastAsia"/>
+        </w:rPr>
+        <w:t>建立</w:t>
+      </w:r>
+    </w:p>
+    <w:p>
+      <w:pPr>
+        <w:rPr>
+          <w:rFonts w:hint="eastAsia"/>
+        </w:rPr>
+      </w:pPr>
       <w:r>
         <w:rPr>
           <w:rFonts w:hint="eastAsia"/>
         </w:rPr>
         <w:t>electricity distribution</w:t>
       </w:r>
-    </w:p>
-    <w:p>
+      <w:r>
+        <w:tab/>
+      </w:r>
+      <w:r>
+        <w:tab/>
+      </w:r>
+      <w:r>
+        <w:rPr>
+          <w:rFonts w:hint="eastAsia"/>
+        </w:rPr>
+        <w:t>电力分配</w:t>
+      </w:r>
+    </w:p>
+    <w:p>
+      <w:pPr>
+        <w:rPr>
+          <w:rFonts w:hint="eastAsia"/>
+        </w:rPr>
+      </w:pPr>
       <w:r>
         <w:rPr>
           <w:rFonts w:hint="eastAsia"/>
         </w:rPr>
         <w:t>accommodate</w:t>
       </w:r>
-    </w:p>
-    <w:p>
+      <w:r>
+        <w:tab/>
+      </w:r>
+      <w:r>
+        <w:rPr>
+          <w:rFonts w:hint="eastAsia"/>
+        </w:rPr>
+        <w:t>容纳</w:t>
+      </w:r>
+    </w:p>
+    <w:p>
+      <w:pPr>
+        <w:rPr>
+          <w:rFonts w:hint="eastAsia"/>
+        </w:rPr>
+      </w:pPr>
       <w:r>
         <w:rPr>
           <w:rFonts w:hint="eastAsia"/>
         </w:rPr>
         <w:t>skyscraper</w:t>
       </w:r>
-    </w:p>
-    <w:p>
+      <w:r>
+        <w:tab/>
+      </w:r>
+      <w:r>
+        <w:rPr>
+          <w:rFonts w:hint="eastAsia"/>
+        </w:rPr>
+        <w:t>摩天大厦</w:t>
+      </w:r>
+    </w:p>
+    <w:p>
+      <w:pPr>
+        <w:rPr>
+          <w:rFonts w:hint="eastAsia"/>
+        </w:rPr>
+      </w:pPr>
       <w:r>
         <w:rPr>
           <w:rFonts w:hint="eastAsia"/>
         </w:rPr>
         <w:t>renewable energy</w:t>
       </w:r>
-    </w:p>
-    <w:p>
+      <w:r>
+        <w:tab/>
+      </w:r>
+      <w:r>
+        <w:rPr>
+          <w:rFonts w:hint="eastAsia"/>
+        </w:rPr>
+        <w:t>可再生能源</w:t>
+      </w:r>
+    </w:p>
+    <w:p>
+      <w:pPr>
+        <w:rPr>
+          <w:rFonts w:hint="eastAsia"/>
+        </w:rPr>
+      </w:pPr>
       <w:r>
         <w:rPr>
           <w:rFonts w:hint="eastAsia"/>
         </w:rPr>
         <w:t>carbon emission</w:t>
       </w:r>
-    </w:p>
-    <w:p>
+      <w:r>
+        <w:tab/>
+      </w:r>
+      <w:r>
+        <w:tab/>
+      </w:r>
+      <w:r>
+        <w:rPr>
+          <w:rFonts w:hint="eastAsia"/>
+        </w:rPr>
+        <w:t>碳排放</w:t>
+      </w:r>
+    </w:p>
+    <w:p>
+      <w:pPr>
+        <w:rPr>
+          <w:rFonts w:hint="eastAsia"/>
+        </w:rPr>
+      </w:pPr>
       <w:r>
         <w:rPr>
           <w:rFonts w:hint="eastAsia"/>
         </w:rPr>
         <w:t>concentration</w:t>
       </w:r>
-    </w:p>
-    <w:p>
+      <w:r>
+        <w:tab/>
+      </w:r>
+      <w:r>
+        <w:rPr>
+          <w:rFonts w:hint="eastAsia"/>
+        </w:rPr>
+        <w:t>浓度、集中</w:t>
+      </w:r>
+    </w:p>
+    <w:p>
+      <w:pPr>
+        <w:rPr>
+          <w:rFonts w:hint="eastAsia"/>
+        </w:rPr>
+      </w:pPr>
       <w:r>
         <w:rPr>
           <w:rFonts w:hint="eastAsia"/>
         </w:rPr>
         <w:t>climate change</w:t>
       </w:r>
-    </w:p>
-    <w:p>
+      <w:r>
+        <w:tab/>
+      </w:r>
+      <w:r>
+        <w:rPr>
+          <w:rFonts w:hint="eastAsia"/>
+        </w:rPr>
+        <w:t>天气变化</w:t>
+      </w:r>
+    </w:p>
+    <w:p>
+      <w:pPr>
+        <w:rPr>
+          <w:rFonts w:hint="eastAsia"/>
+        </w:rPr>
+      </w:pPr>
       <w:r>
         <w:rPr>
           <w:rFonts w:hint="eastAsia"/>
         </w:rPr>
         <w:t>vulnerable</w:t>
       </w:r>
-    </w:p>
-    <w:p>
+      <w:r>
+        <w:tab/>
+      </w:r>
+      <w:r>
+        <w:rPr>
+          <w:rFonts w:hint="eastAsia"/>
+        </w:rPr>
+        <w:t>易脆的</w:t>
+      </w:r>
+    </w:p>
+    <w:p>
+      <w:pPr>
+        <w:rPr>
+          <w:rFonts w:hint="eastAsia"/>
+        </w:rPr>
+      </w:pPr>
       <w:r>
         <w:rPr>
           <w:rFonts w:hint="eastAsia"/>
         </w:rPr>
         <w:t>citizen</w:t>
       </w:r>
-    </w:p>
-    <w:p>
+      <w:r>
+        <w:tab/>
+      </w:r>
+      <w:r>
+        <w:rPr>
+          <w:rFonts w:hint="eastAsia"/>
+        </w:rPr>
+        <w:t>市民</w:t>
+      </w:r>
+    </w:p>
+    <w:p>
+      <w:pPr>
+        <w:rPr>
+          <w:rFonts w:hint="eastAsia"/>
+        </w:rPr>
+      </w:pPr>
       <w:r>
         <w:rPr>
           <w:rFonts w:hint="eastAsia"/>
         </w:rPr>
         <w:t>disaster</w:t>
       </w:r>
-    </w:p>
-    <w:p>
+      <w:r>
+        <w:tab/>
+      </w:r>
+      <w:r>
+        <w:tab/>
+      </w:r>
+      <w:r>
+        <w:rPr>
+          <w:rFonts w:hint="eastAsia"/>
+        </w:rPr>
+        <w:t>疾病</w:t>
+      </w:r>
+    </w:p>
+    <w:p>
+      <w:pPr>
+        <w:rPr>
+          <w:rFonts w:hint="eastAsia"/>
+        </w:rPr>
+      </w:pPr>
       <w:r>
         <w:rPr>
           <w:rFonts w:hint="eastAsia"/>
         </w:rPr>
         <w:t>smart technologies</w:t>
       </w:r>
-    </w:p>
-    <w:p>
+      <w:r>
+        <w:tab/>
+      </w:r>
+      <w:r>
+        <w:rPr>
+          <w:rFonts w:hint="eastAsia"/>
+        </w:rPr>
+        <w:t>智能科技</w:t>
+      </w:r>
+    </w:p>
+    <w:p>
+      <w:pPr>
+        <w:rPr>
+          <w:rFonts w:hint="eastAsia"/>
+        </w:rPr>
+      </w:pPr>
       <w:r>
         <w:rPr>
           <w:rFonts w:hint="eastAsia"/>
         </w:rPr>
         <w:t>integrated systems</w:t>
       </w:r>
-    </w:p>
-    <w:p>
+      <w:r>
+        <w:tab/>
+      </w:r>
+      <w:r>
+        <w:rPr>
+          <w:rFonts w:hint="eastAsia"/>
+        </w:rPr>
+        <w:t>混合系统</w:t>
+      </w:r>
+    </w:p>
+    <w:p>
+      <w:pPr>
+        <w:rPr>
+          <w:rFonts w:hint="eastAsia"/>
+        </w:rPr>
+      </w:pPr>
       <w:r>
         <w:rPr>
           <w:rFonts w:hint="eastAsia"/>
         </w:rPr>
         <w:t>carbon-neutral</w:t>
       </w:r>
-    </w:p>
-    <w:p>
+      <w:r>
+        <w:tab/>
+      </w:r>
+      <w:r>
+        <w:rPr>
+          <w:rFonts w:hint="eastAsia"/>
+        </w:rPr>
+        <w:t>碳中和</w:t>
+      </w:r>
+    </w:p>
+    <w:p>
+      <w:pPr>
+        <w:rPr>
+          <w:rFonts w:hint="eastAsia"/>
+        </w:rPr>
+      </w:pPr>
       <w:r>
         <w:rPr>
           <w:rFonts w:hint="eastAsia"/>
         </w:rPr>
         <w:t>resident</w:t>
       </w:r>
-    </w:p>
-    <w:p>
+      <w:r>
+        <w:tab/>
+      </w:r>
+      <w:r>
+        <w:rPr>
+          <w:rFonts w:hint="eastAsia"/>
+        </w:rPr>
+        <w:t>抵抗</w:t>
+      </w:r>
+    </w:p>
+    <w:p>
+      <w:pPr>
+        <w:rPr>
+          <w:rFonts w:hint="eastAsia"/>
+        </w:rPr>
+      </w:pPr>
       <w:r>
         <w:rPr>
           <w:rFonts w:hint="eastAsia"/>
         </w:rPr>
         <w:t>demand</w:t>
       </w:r>
-    </w:p>
-    <w:p>
+      <w:r>
+        <w:tab/>
+      </w:r>
+      <w:r>
+        <w:tab/>
+      </w:r>
+      <w:r>
+        <w:rPr>
+          <w:rFonts w:hint="eastAsia"/>
+        </w:rPr>
+        <w:t>要求</w:t>
+      </w:r>
+    </w:p>
+    <w:p>
+      <w:pPr>
+        <w:rPr>
+          <w:rFonts w:hint="eastAsia"/>
+        </w:rPr>
+      </w:pPr>
       <w:r>
         <w:rPr>
           <w:rFonts w:hint="eastAsia"/>
@@ -747,216 +1916,597 @@
         <w:lastRenderedPageBreak/>
         <w:t>decision makers</w:t>
       </w:r>
-    </w:p>
-    <w:p>
+      <w:r>
+        <w:tab/>
+      </w:r>
+      <w:r>
+        <w:tab/>
+      </w:r>
+      <w:r>
+        <w:rPr>
+          <w:rFonts w:hint="eastAsia"/>
+        </w:rPr>
+        <w:t>决策者</w:t>
+      </w:r>
+    </w:p>
+    <w:p>
+      <w:pPr>
+        <w:rPr>
+          <w:rFonts w:hint="eastAsia"/>
+        </w:rPr>
+      </w:pPr>
       <w:r>
         <w:rPr>
           <w:rFonts w:hint="eastAsia"/>
         </w:rPr>
         <w:t>surface</w:t>
       </w:r>
-    </w:p>
-    <w:p>
+      <w:r>
+        <w:tab/>
+      </w:r>
+      <w:r>
+        <w:rPr>
+          <w:rFonts w:hint="eastAsia"/>
+        </w:rPr>
+        <w:t>表面</w:t>
+      </w:r>
+    </w:p>
+    <w:p>
+      <w:pPr>
+        <w:rPr>
+          <w:rFonts w:hint="eastAsia"/>
+        </w:rPr>
+      </w:pPr>
       <w:r>
         <w:rPr>
           <w:rFonts w:hint="eastAsia"/>
         </w:rPr>
         <w:t>combination</w:t>
       </w:r>
-    </w:p>
-    <w:p>
+      <w:r>
+        <w:tab/>
+      </w:r>
+      <w:r>
+        <w:rPr>
+          <w:rFonts w:hint="eastAsia"/>
+        </w:rPr>
+        <w:t>结合</w:t>
+      </w:r>
+    </w:p>
+    <w:p>
+      <w:pPr>
+        <w:rPr>
+          <w:rFonts w:hint="eastAsia"/>
+        </w:rPr>
+      </w:pPr>
       <w:r>
         <w:rPr>
           <w:rFonts w:hint="eastAsia"/>
         </w:rPr>
         <w:t>exploit</w:t>
       </w:r>
-    </w:p>
-    <w:p>
+      <w:r>
+        <w:tab/>
+      </w:r>
+      <w:r>
+        <w:rPr>
+          <w:rFonts w:hint="eastAsia"/>
+        </w:rPr>
+        <w:t>利用、开发</w:t>
+      </w:r>
+    </w:p>
+    <w:p>
+      <w:pPr>
+        <w:rPr>
+          <w:rFonts w:hint="eastAsia"/>
+        </w:rPr>
+      </w:pPr>
       <w:r>
         <w:rPr>
           <w:rFonts w:hint="eastAsia"/>
         </w:rPr>
         <w:t>anticipate</w:t>
       </w:r>
-    </w:p>
-    <w:p>
+      <w:r>
+        <w:tab/>
+      </w:r>
+      <w:r>
+        <w:rPr>
+          <w:rFonts w:hint="eastAsia"/>
+        </w:rPr>
+        <w:t>期望</w:t>
+      </w:r>
+    </w:p>
+    <w:p>
+      <w:pPr>
+        <w:rPr>
+          <w:rFonts w:hint="eastAsia"/>
+        </w:rPr>
+      </w:pPr>
       <w:r>
         <w:rPr>
           <w:rFonts w:hint="eastAsia"/>
         </w:rPr>
         <w:t>neighborhood</w:t>
       </w:r>
-    </w:p>
-    <w:p>
+      <w:r>
+        <w:tab/>
+      </w:r>
+      <w:r>
+        <w:rPr>
+          <w:rFonts w:hint="eastAsia"/>
+        </w:rPr>
+        <w:t>邻居</w:t>
+      </w:r>
+    </w:p>
+    <w:p>
+      <w:pPr>
+        <w:rPr>
+          <w:rFonts w:hint="eastAsia"/>
+        </w:rPr>
+      </w:pPr>
       <w:r>
         <w:rPr>
           <w:rFonts w:hint="eastAsia"/>
         </w:rPr>
         <w:t>implement</w:t>
       </w:r>
-    </w:p>
-    <w:p>
+      <w:r>
+        <w:tab/>
+      </w:r>
+      <w:r>
+        <w:rPr>
+          <w:rFonts w:hint="eastAsia"/>
+        </w:rPr>
+        <w:t>实施</w:t>
+      </w:r>
+    </w:p>
+    <w:p>
+      <w:pPr>
+        <w:rPr>
+          <w:rFonts w:hint="eastAsia"/>
+        </w:rPr>
+      </w:pPr>
       <w:r>
         <w:rPr>
           <w:rFonts w:hint="eastAsia"/>
         </w:rPr>
         <w:t>domestic</w:t>
       </w:r>
-    </w:p>
-    <w:p>
+      <w:r>
+        <w:tab/>
+      </w:r>
+      <w:r>
+        <w:rPr>
+          <w:rFonts w:hint="eastAsia"/>
+        </w:rPr>
+        <w:t>国内的、家庭的</w:t>
+      </w:r>
+    </w:p>
+    <w:p>
+      <w:pPr>
+        <w:rPr>
+          <w:rFonts w:hint="eastAsia"/>
+        </w:rPr>
+      </w:pPr>
       <w:r>
         <w:rPr>
           <w:rFonts w:hint="eastAsia"/>
         </w:rPr>
         <w:t>automation</w:t>
       </w:r>
-    </w:p>
-    <w:p>
+      <w:r>
+        <w:tab/>
+      </w:r>
+      <w:r>
+        <w:rPr>
+          <w:rFonts w:hint="eastAsia"/>
+        </w:rPr>
+        <w:t>自动化</w:t>
+      </w:r>
+    </w:p>
+    <w:p>
+      <w:pPr>
+        <w:rPr>
+          <w:rFonts w:hint="eastAsia"/>
+        </w:rPr>
+      </w:pPr>
       <w:r>
         <w:rPr>
           <w:rFonts w:hint="eastAsia"/>
         </w:rPr>
         <w:t>habitat</w:t>
       </w:r>
-    </w:p>
-    <w:p>
+      <w:r>
+        <w:tab/>
+      </w:r>
+      <w:r>
+        <w:rPr>
+          <w:rFonts w:hint="eastAsia"/>
+        </w:rPr>
+        <w:t>栖息地</w:t>
+      </w:r>
+    </w:p>
+    <w:p>
+      <w:pPr>
+        <w:rPr>
+          <w:rFonts w:hint="eastAsia"/>
+        </w:rPr>
+      </w:pPr>
       <w:r>
         <w:rPr>
           <w:rFonts w:hint="eastAsia"/>
         </w:rPr>
         <w:t>secure</w:t>
       </w:r>
-    </w:p>
-    <w:p>
+      <w:r>
+        <w:tab/>
+      </w:r>
+      <w:r>
+        <w:rPr>
+          <w:rFonts w:hint="eastAsia"/>
+        </w:rPr>
+        <w:t>安保</w:t>
+      </w:r>
+    </w:p>
+    <w:p>
+      <w:pPr>
+        <w:rPr>
+          <w:rFonts w:hint="eastAsia"/>
+        </w:rPr>
+      </w:pPr>
       <w:r>
         <w:rPr>
           <w:rFonts w:hint="eastAsia"/>
         </w:rPr>
         <w:t>dramatically</w:t>
       </w:r>
-    </w:p>
-    <w:p>
+      <w:r>
+        <w:tab/>
+      </w:r>
+      <w:r>
+        <w:rPr>
+          <w:rFonts w:hint="eastAsia"/>
+        </w:rPr>
+        <w:t>剧烈地</w:t>
+      </w:r>
+    </w:p>
+    <w:p>
+      <w:pPr>
+        <w:rPr>
+          <w:rFonts w:hint="eastAsia"/>
+        </w:rPr>
+      </w:pPr>
       <w:r>
         <w:rPr>
           <w:rFonts w:hint="eastAsia"/>
         </w:rPr>
         <w:t>extinct</w:t>
       </w:r>
-    </w:p>
-    <w:p>
+      <w:r>
+        <w:tab/>
+      </w:r>
+      <w:r>
+        <w:rPr>
+          <w:rFonts w:hint="eastAsia"/>
+        </w:rPr>
+        <w:t>灭亡</w:t>
+      </w:r>
+    </w:p>
+    <w:p>
+      <w:pPr>
+        <w:rPr>
+          <w:rFonts w:hint="eastAsia"/>
+        </w:rPr>
+      </w:pPr>
       <w:r>
         <w:rPr>
           <w:rFonts w:hint="eastAsia"/>
         </w:rPr>
         <w:t>collapse</w:t>
       </w:r>
-    </w:p>
-    <w:p>
+      <w:r>
+        <w:tab/>
+      </w:r>
+      <w:r>
+        <w:rPr>
+          <w:rFonts w:hint="eastAsia"/>
+        </w:rPr>
+        <w:t>合作</w:t>
+      </w:r>
+    </w:p>
+    <w:p>
+      <w:pPr>
+        <w:rPr>
+          <w:rFonts w:hint="eastAsia"/>
+        </w:rPr>
+      </w:pPr>
       <w:r>
         <w:rPr>
           <w:rFonts w:hint="eastAsia"/>
         </w:rPr>
         <w:t>ecosystem</w:t>
       </w:r>
-    </w:p>
-    <w:p>
+      <w:r>
+        <w:tab/>
+      </w:r>
+      <w:r>
+        <w:rPr>
+          <w:rFonts w:hint="eastAsia"/>
+        </w:rPr>
+        <w:t>经济系统</w:t>
+      </w:r>
+    </w:p>
+    <w:p>
+      <w:pPr>
+        <w:rPr>
+          <w:rFonts w:hint="eastAsia"/>
+        </w:rPr>
+      </w:pPr>
       <w:r>
         <w:rPr>
           <w:rFonts w:hint="eastAsia"/>
         </w:rPr>
         <w:t>intertwine</w:t>
       </w:r>
-    </w:p>
-    <w:p>
+      <w:r>
+        <w:tab/>
+      </w:r>
+      <w:r>
+        <w:rPr>
+          <w:rFonts w:hint="eastAsia"/>
+        </w:rPr>
+        <w:t>互联</w:t>
+      </w:r>
+    </w:p>
+    <w:p>
+      <w:pPr>
+        <w:rPr>
+          <w:rFonts w:hint="eastAsia"/>
+        </w:rPr>
+      </w:pPr>
       <w:r>
         <w:rPr>
           <w:rFonts w:hint="eastAsia"/>
         </w:rPr>
         <w:t>herbivore</w:t>
       </w:r>
-    </w:p>
-    <w:p>
+      <w:r>
+        <w:tab/>
+      </w:r>
+      <w:r>
+        <w:rPr>
+          <w:rFonts w:hint="eastAsia"/>
+        </w:rPr>
+        <w:t>食草动物</w:t>
+      </w:r>
+    </w:p>
+    <w:p>
+      <w:pPr>
+        <w:rPr>
+          <w:rFonts w:hint="eastAsia"/>
+        </w:rPr>
+      </w:pPr>
       <w:r>
         <w:rPr>
           <w:rFonts w:hint="eastAsia"/>
         </w:rPr>
         <w:t>insect</w:t>
       </w:r>
-    </w:p>
-    <w:p>
+      <w:r>
+        <w:tab/>
+      </w:r>
+      <w:r>
+        <w:rPr>
+          <w:rFonts w:hint="eastAsia"/>
+        </w:rPr>
+        <w:t>昆虫</w:t>
+      </w:r>
+    </w:p>
+    <w:p>
+      <w:pPr>
+        <w:rPr>
+          <w:rFonts w:hint="eastAsia"/>
+        </w:rPr>
+      </w:pPr>
       <w:r>
         <w:rPr>
           <w:rFonts w:hint="eastAsia"/>
         </w:rPr>
         <w:t>fluctuation</w:t>
       </w:r>
-    </w:p>
-    <w:p>
+      <w:r>
+        <w:tab/>
+      </w:r>
+      <w:r>
+        <w:rPr>
+          <w:rFonts w:hint="eastAsia"/>
+        </w:rPr>
+        <w:t>波动</w:t>
+      </w:r>
+    </w:p>
+    <w:p>
+      <w:pPr>
+        <w:rPr>
+          <w:rFonts w:hint="eastAsia"/>
+        </w:rPr>
+      </w:pPr>
       <w:r>
         <w:rPr>
           <w:rFonts w:hint="eastAsia"/>
         </w:rPr>
         <w:t>gene pool</w:t>
       </w:r>
-    </w:p>
-    <w:p>
+      <w:r>
+        <w:tab/>
+      </w:r>
+      <w:r>
+        <w:rPr>
+          <w:rFonts w:hint="eastAsia"/>
+        </w:rPr>
+        <w:t>基因库</w:t>
+      </w:r>
+    </w:p>
+    <w:p>
+      <w:pPr>
+        <w:rPr>
+          <w:rFonts w:hint="eastAsia"/>
+        </w:rPr>
+      </w:pPr>
       <w:r>
         <w:rPr>
           <w:rFonts w:hint="eastAsia"/>
         </w:rPr>
         <w:t>complexity</w:t>
       </w:r>
-    </w:p>
-    <w:p>
+      <w:r>
+        <w:tab/>
+      </w:r>
+      <w:r>
+        <w:rPr>
+          <w:rFonts w:hint="eastAsia"/>
+        </w:rPr>
+        <w:t>复杂性</w:t>
+      </w:r>
+    </w:p>
+    <w:p>
+      <w:pPr>
+        <w:rPr>
+          <w:rFonts w:hint="eastAsia"/>
+        </w:rPr>
+      </w:pPr>
       <w:r>
         <w:rPr>
           <w:rFonts w:hint="eastAsia"/>
         </w:rPr>
         <w:t>resilient</w:t>
       </w:r>
-    </w:p>
-    <w:p>
+      <w:r>
+        <w:tab/>
+      </w:r>
+      <w:r>
+        <w:rPr>
+          <w:rFonts w:hint="eastAsia"/>
+        </w:rPr>
+        <w:t>有弹性的</w:t>
+      </w:r>
+    </w:p>
+    <w:p>
+      <w:pPr>
+        <w:rPr>
+          <w:rFonts w:hint="eastAsia"/>
+        </w:rPr>
+      </w:pPr>
       <w:r>
         <w:rPr>
           <w:rFonts w:hint="eastAsia"/>
         </w:rPr>
         <w:t>recover</w:t>
       </w:r>
-    </w:p>
-    <w:p>
+      <w:r>
+        <w:tab/>
+      </w:r>
+      <w:r>
+        <w:rPr>
+          <w:rFonts w:hint="eastAsia"/>
+        </w:rPr>
+        <w:t>恢复</w:t>
+      </w:r>
+    </w:p>
+    <w:p>
+      <w:pPr>
+        <w:rPr>
+          <w:rFonts w:hint="eastAsia"/>
+        </w:rPr>
+      </w:pPr>
       <w:r>
         <w:rPr>
           <w:rFonts w:hint="eastAsia"/>
         </w:rPr>
         <w:t>interdependent</w:t>
       </w:r>
-    </w:p>
-    <w:p>
+      <w:r>
+        <w:tab/>
+      </w:r>
+      <w:r>
+        <w:rPr>
+          <w:rFonts w:hint="eastAsia"/>
+        </w:rPr>
+        <w:t>相互依赖的</w:t>
+      </w:r>
+    </w:p>
+    <w:p>
+      <w:pPr>
+        <w:rPr>
+          <w:rFonts w:hint="eastAsia"/>
+        </w:rPr>
+      </w:pPr>
       <w:r>
         <w:rPr>
           <w:rFonts w:hint="eastAsia"/>
         </w:rPr>
         <w:t>unpredictable</w:t>
       </w:r>
-    </w:p>
-    <w:p>
+      <w:r>
+        <w:tab/>
+      </w:r>
+      <w:r>
+        <w:rPr>
+          <w:rFonts w:hint="eastAsia"/>
+        </w:rPr>
+        <w:t>不可预测的</w:t>
+      </w:r>
+    </w:p>
+    <w:p>
+      <w:pPr>
+        <w:rPr>
+          <w:rFonts w:hint="eastAsia"/>
+        </w:rPr>
+      </w:pPr>
       <w:r>
         <w:rPr>
           <w:rFonts w:hint="eastAsia"/>
         </w:rPr>
         <w:t>emerging</w:t>
       </w:r>
-    </w:p>
-    <w:p>
+      <w:r>
+        <w:tab/>
+      </w:r>
+      <w:r>
+        <w:rPr>
+          <w:rFonts w:hint="eastAsia"/>
+        </w:rPr>
+        <w:t>？</w:t>
+      </w:r>
+    </w:p>
+    <w:p>
+      <w:pPr>
+        <w:rPr>
+          <w:rFonts w:hint="eastAsia"/>
+        </w:rPr>
+      </w:pPr>
       <w:r>
         <w:rPr>
           <w:rFonts w:hint="eastAsia"/>
         </w:rPr>
         <w:t>landscape</w:t>
       </w:r>
-    </w:p>
-    <w:p>
+      <w:r>
+        <w:tab/>
+      </w:r>
+      <w:r>
+        <w:rPr>
+          <w:rFonts w:hint="eastAsia"/>
+        </w:rPr>
+        <w:t>？</w:t>
+      </w:r>
+    </w:p>
+    <w:p>
+      <w:pPr>
+        <w:rPr>
+          <w:rFonts w:hint="eastAsia"/>
+        </w:rPr>
+      </w:pPr>
       <w:r>
         <w:rPr>
           <w:rFonts w:hint="eastAsia"/>
@@ -964,189 +2514,547 @@
         <w:lastRenderedPageBreak/>
         <w:t>territory</w:t>
       </w:r>
-    </w:p>
-    <w:p>
+      <w:r>
+        <w:tab/>
+      </w:r>
+      <w:r>
+        <w:rPr>
+          <w:rFonts w:hint="eastAsia"/>
+        </w:rPr>
+        <w:t>领地</w:t>
+      </w:r>
+    </w:p>
+    <w:p>
+      <w:pPr>
+        <w:rPr>
+          <w:rFonts w:hint="eastAsia"/>
+        </w:rPr>
+      </w:pPr>
       <w:r>
         <w:rPr>
           <w:rFonts w:hint="eastAsia"/>
         </w:rPr>
         <w:t>dweller</w:t>
       </w:r>
-    </w:p>
-    <w:p>
+      <w:r>
+        <w:tab/>
+      </w:r>
+      <w:r>
+        <w:rPr>
+          <w:rFonts w:hint="eastAsia"/>
+        </w:rPr>
+        <w:t>居民</w:t>
+      </w:r>
+    </w:p>
+    <w:p>
+      <w:pPr>
+        <w:rPr>
+          <w:rFonts w:hint="eastAsia"/>
+        </w:rPr>
+      </w:pPr>
       <w:r>
         <w:rPr>
           <w:rFonts w:hint="eastAsia"/>
         </w:rPr>
         <w:t>peaceful harmony</w:t>
       </w:r>
-    </w:p>
-    <w:p>
+      <w:r>
+        <w:tab/>
+      </w:r>
+      <w:r>
+        <w:rPr>
+          <w:rFonts w:hint="eastAsia"/>
+        </w:rPr>
+        <w:t>和平</w:t>
+      </w:r>
+    </w:p>
+    <w:p>
+      <w:pPr>
+        <w:rPr>
+          <w:rFonts w:hint="eastAsia"/>
+        </w:rPr>
+      </w:pPr>
       <w:r>
         <w:rPr>
           <w:rFonts w:hint="eastAsia"/>
         </w:rPr>
         <w:t>predominant</w:t>
       </w:r>
-    </w:p>
-    <w:p>
+      <w:r>
+        <w:tab/>
+      </w:r>
+      <w:r>
+        <w:tab/>
+      </w:r>
+      <w:r>
+        <w:rPr>
+          <w:rFonts w:hint="eastAsia"/>
+        </w:rPr>
+        <w:t>占主导地位的</w:t>
+      </w:r>
+    </w:p>
+    <w:p>
+      <w:pPr>
+        <w:rPr>
+          <w:rFonts w:hint="eastAsia"/>
+        </w:rPr>
+      </w:pPr>
       <w:r>
         <w:rPr>
           <w:rFonts w:hint="eastAsia"/>
         </w:rPr>
         <w:t>settlement</w:t>
       </w:r>
-    </w:p>
-    <w:p>
+      <w:r>
+        <w:tab/>
+      </w:r>
+      <w:r>
+        <w:rPr>
+          <w:rFonts w:hint="eastAsia"/>
+        </w:rPr>
+        <w:t>居住地</w:t>
+      </w:r>
+    </w:p>
+    <w:p>
+      <w:pPr>
+        <w:rPr>
+          <w:rFonts w:hint="eastAsia"/>
+        </w:rPr>
+      </w:pPr>
       <w:r>
         <w:rPr>
           <w:rFonts w:hint="eastAsia"/>
         </w:rPr>
         <w:t>immune system</w:t>
       </w:r>
-    </w:p>
-    <w:p>
+      <w:r>
+        <w:tab/>
+      </w:r>
+      <w:r>
+        <w:rPr>
+          <w:rFonts w:hint="eastAsia"/>
+        </w:rPr>
+        <w:t>？</w:t>
+      </w:r>
+    </w:p>
+    <w:p>
+      <w:pPr>
+        <w:rPr>
+          <w:rFonts w:hint="eastAsia"/>
+        </w:rPr>
+      </w:pPr>
       <w:r>
         <w:rPr>
           <w:rFonts w:hint="eastAsia"/>
         </w:rPr>
         <w:t>endangered</w:t>
       </w:r>
-    </w:p>
-    <w:p>
+      <w:r>
+        <w:tab/>
+      </w:r>
+      <w:r>
+        <w:rPr>
+          <w:rFonts w:hint="eastAsia"/>
+        </w:rPr>
+        <w:t>濒危的</w:t>
+      </w:r>
+    </w:p>
+    <w:p>
+      <w:pPr>
+        <w:rPr>
+          <w:rFonts w:hint="eastAsia"/>
+        </w:rPr>
+      </w:pPr>
       <w:r>
         <w:rPr>
           <w:rFonts w:hint="eastAsia"/>
         </w:rPr>
         <w:t>evolution</w:t>
       </w:r>
-    </w:p>
-    <w:p>
+      <w:r>
+        <w:tab/>
+      </w:r>
+      <w:r>
+        <w:rPr>
+          <w:rFonts w:hint="eastAsia"/>
+        </w:rPr>
+        <w:t>进化</w:t>
+      </w:r>
+    </w:p>
+    <w:p>
+      <w:pPr>
+        <w:rPr>
+          <w:rFonts w:hint="eastAsia"/>
+        </w:rPr>
+      </w:pPr>
       <w:r>
         <w:rPr>
           <w:rFonts w:hint="eastAsia"/>
         </w:rPr>
         <w:t>decrease</w:t>
       </w:r>
-    </w:p>
-    <w:p>
+      <w:r>
+        <w:tab/>
+      </w:r>
+      <w:r>
+        <w:tab/>
+      </w:r>
+      <w:r>
+        <w:rPr>
+          <w:rFonts w:hint="eastAsia"/>
+        </w:rPr>
+        <w:t>消减</w:t>
+      </w:r>
+    </w:p>
+    <w:p>
+      <w:pPr>
+        <w:rPr>
+          <w:rFonts w:hint="eastAsia"/>
+        </w:rPr>
+      </w:pPr>
       <w:r>
         <w:rPr>
           <w:rFonts w:hint="eastAsia"/>
         </w:rPr>
         <w:t>genetic variation</w:t>
       </w:r>
-    </w:p>
-    <w:p>
+      <w:r>
+        <w:tab/>
+      </w:r>
+      <w:r>
+        <w:tab/>
+      </w:r>
+      <w:r>
+        <w:rPr>
+          <w:rFonts w:hint="eastAsia"/>
+        </w:rPr>
+        <w:t>遗传变异、基因变异</w:t>
+      </w:r>
+    </w:p>
+    <w:p>
+      <w:pPr>
+        <w:rPr>
+          <w:rFonts w:hint="eastAsia"/>
+        </w:rPr>
+      </w:pPr>
       <w:r>
         <w:rPr>
           <w:rFonts w:hint="eastAsia"/>
         </w:rPr>
         <w:t>resource exploitation</w:t>
       </w:r>
-    </w:p>
-    <w:p>
+      <w:r>
+        <w:tab/>
+      </w:r>
+      <w:r>
+        <w:tab/>
+      </w:r>
+      <w:r>
+        <w:rPr>
+          <w:rFonts w:hint="eastAsia"/>
+        </w:rPr>
+        <w:t>资源利用</w:t>
+      </w:r>
+    </w:p>
+    <w:p>
+      <w:pPr>
+        <w:rPr>
+          <w:rFonts w:hint="eastAsia"/>
+        </w:rPr>
+      </w:pPr>
       <w:r>
         <w:rPr>
           <w:rFonts w:hint="eastAsia"/>
         </w:rPr>
         <w:t>destruction</w:t>
       </w:r>
-    </w:p>
-    <w:p>
+      <w:r>
+        <w:tab/>
+      </w:r>
+      <w:r>
+        <w:rPr>
+          <w:rFonts w:hint="eastAsia"/>
+        </w:rPr>
+        <w:t>摧毁、破坏</w:t>
+      </w:r>
+    </w:p>
+    <w:p>
+      <w:pPr>
+        <w:rPr>
+          <w:rFonts w:hint="eastAsia"/>
+        </w:rPr>
+      </w:pPr>
       <w:r>
         <w:rPr>
           <w:rFonts w:hint="eastAsia"/>
         </w:rPr>
         <w:t>chemical compound</w:t>
       </w:r>
-    </w:p>
-    <w:p>
+      <w:r>
+        <w:tab/>
+      </w:r>
+      <w:r>
+        <w:rPr>
+          <w:rFonts w:hint="eastAsia"/>
+        </w:rPr>
+        <w:t>化学混合物</w:t>
+      </w:r>
+    </w:p>
+    <w:p>
+      <w:pPr>
+        <w:rPr>
+          <w:rFonts w:hint="eastAsia"/>
+        </w:rPr>
+      </w:pPr>
       <w:r>
         <w:rPr>
           <w:rFonts w:hint="eastAsia"/>
         </w:rPr>
         <w:t>derive from</w:t>
       </w:r>
-    </w:p>
-    <w:p>
+      <w:r>
+        <w:tab/>
+      </w:r>
+      <w:r>
+        <w:rPr>
+          <w:rFonts w:hint="eastAsia"/>
+        </w:rPr>
+        <w:t>导致</w:t>
+      </w:r>
+    </w:p>
+    <w:p>
+      <w:pPr>
+        <w:rPr>
+          <w:rFonts w:hint="eastAsia"/>
+        </w:rPr>
+      </w:pPr>
       <w:r>
         <w:rPr>
           <w:rFonts w:hint="eastAsia"/>
         </w:rPr>
         <w:t>mammal</w:t>
       </w:r>
-    </w:p>
-    <w:p>
+      <w:r>
+        <w:tab/>
+      </w:r>
+      <w:r>
+        <w:tab/>
+      </w:r>
+      <w:r>
+        <w:rPr>
+          <w:rFonts w:hint="eastAsia"/>
+        </w:rPr>
+        <w:t>哺乳动物</w:t>
+      </w:r>
+    </w:p>
+    <w:p>
+      <w:pPr>
+        <w:rPr>
+          <w:rFonts w:hint="eastAsia"/>
+        </w:rPr>
+      </w:pPr>
       <w:r>
         <w:rPr>
           <w:rFonts w:hint="eastAsia"/>
         </w:rPr>
         <w:t>kidney</w:t>
       </w:r>
-    </w:p>
-    <w:p>
+      <w:r>
+        <w:tab/>
+      </w:r>
+      <w:r>
+        <w:rPr>
+          <w:rFonts w:hint="eastAsia"/>
+        </w:rPr>
+        <w:t>肾脏</w:t>
+      </w:r>
+    </w:p>
+    <w:p>
+      <w:pPr>
+        <w:rPr>
+          <w:rFonts w:hint="eastAsia"/>
+        </w:rPr>
+      </w:pPr>
       <w:r>
         <w:rPr>
           <w:rFonts w:hint="eastAsia"/>
         </w:rPr>
         <w:t>recreation</w:t>
       </w:r>
-    </w:p>
-    <w:p>
+      <w:r>
+        <w:tab/>
+      </w:r>
+      <w:r>
+        <w:rPr>
+          <w:rFonts w:hint="eastAsia"/>
+        </w:rPr>
+        <w:t>重新建造</w:t>
+      </w:r>
+    </w:p>
+    <w:p>
+      <w:pPr>
+        <w:rPr>
+          <w:rFonts w:hint="eastAsia"/>
+        </w:rPr>
+      </w:pPr>
       <w:r>
         <w:rPr>
           <w:rFonts w:hint="eastAsia"/>
         </w:rPr>
         <w:t>preserve</w:t>
       </w:r>
-    </w:p>
-    <w:p>
+      <w:r>
+        <w:tab/>
+      </w:r>
+      <w:r>
+        <w:tab/>
+      </w:r>
+      <w:r>
+        <w:rPr>
+          <w:rFonts w:hint="eastAsia"/>
+        </w:rPr>
+        <w:t>保存、节约</w:t>
+      </w:r>
+    </w:p>
+    <w:p>
+      <w:pPr>
+        <w:rPr>
+          <w:rFonts w:hint="eastAsia"/>
+        </w:rPr>
+      </w:pPr>
       <w:r>
         <w:rPr>
           <w:rFonts w:hint="eastAsia"/>
         </w:rPr>
         <w:t>wetland</w:t>
       </w:r>
-    </w:p>
-    <w:p>
+      <w:r>
+        <w:tab/>
+      </w:r>
+      <w:r>
+        <w:tab/>
+      </w:r>
+      <w:r>
+        <w:rPr>
+          <w:rFonts w:hint="eastAsia"/>
+        </w:rPr>
+        <w:t>湿地</w:t>
+      </w:r>
+    </w:p>
+    <w:p>
+      <w:pPr>
+        <w:rPr>
+          <w:rFonts w:hint="eastAsia"/>
+        </w:rPr>
+      </w:pPr>
       <w:r>
         <w:rPr>
           <w:rFonts w:hint="eastAsia"/>
         </w:rPr>
         <w:t>particle</w:t>
       </w:r>
-    </w:p>
-    <w:p>
+      <w:r>
+        <w:tab/>
+      </w:r>
+      <w:r>
+        <w:tab/>
+      </w:r>
+      <w:r>
+        <w:rPr>
+          <w:rFonts w:hint="eastAsia"/>
+        </w:rPr>
+        <w:t>微粒</w:t>
+      </w:r>
+    </w:p>
+    <w:p>
+      <w:pPr>
+        <w:rPr>
+          <w:rFonts w:hint="eastAsia"/>
+        </w:rPr>
+      </w:pPr>
       <w:r>
         <w:rPr>
           <w:rFonts w:hint="eastAsia"/>
         </w:rPr>
         <w:t>erosion</w:t>
       </w:r>
-    </w:p>
-    <w:p>
+      <w:r>
+        <w:tab/>
+      </w:r>
+      <w:r>
+        <w:tab/>
+      </w:r>
+      <w:r>
+        <w:rPr>
+          <w:rFonts w:hint="eastAsia"/>
+        </w:rPr>
+        <w:t>腐蚀</w:t>
+      </w:r>
+    </w:p>
+    <w:p>
+      <w:pPr>
+        <w:rPr>
+          <w:rFonts w:hint="eastAsia"/>
+        </w:rPr>
+      </w:pPr>
       <w:r>
         <w:rPr>
           <w:rFonts w:hint="eastAsia"/>
         </w:rPr>
         <w:t>restore</w:t>
       </w:r>
-    </w:p>
-    <w:p>
+      <w:r>
+        <w:tab/>
+      </w:r>
+      <w:r>
+        <w:rPr>
+          <w:rFonts w:hint="eastAsia"/>
+        </w:rPr>
+        <w:t>回复</w:t>
+      </w:r>
+    </w:p>
+    <w:p>
+      <w:pPr>
+        <w:rPr>
+          <w:rFonts w:hint="eastAsia"/>
+        </w:rPr>
+      </w:pPr>
       <w:r>
         <w:rPr>
           <w:rFonts w:hint="eastAsia"/>
         </w:rPr>
         <w:t>desertification</w:t>
       </w:r>
-    </w:p>
-    <w:p>
+      <w:r>
+        <w:tab/>
+      </w:r>
+      <w:r>
+        <w:rPr>
+          <w:rFonts w:hint="eastAsia"/>
+        </w:rPr>
+        <w:t>荒漠化</w:t>
+      </w:r>
+    </w:p>
+    <w:p>
+      <w:pPr>
+        <w:rPr>
+          <w:rFonts w:hint="eastAsia"/>
+        </w:rPr>
+      </w:pPr>
       <w:r>
         <w:rPr>
           <w:rFonts w:hint="eastAsia"/>
         </w:rPr>
         <w:t xml:space="preserve">excavation </w:t>
+      </w:r>
+      <w:r>
+        <w:tab/>
+      </w:r>
+      <w:r>
+        <w:rPr>
+          <w:rFonts w:hint="eastAsia"/>
+        </w:rPr>
+        <w:t>？</w:t>
       </w:r>
     </w:p>
     <w:sectPr>

</xml_diff>